<commit_message>
Docs: link the ChatGPT Chrome extension and fix its name; links in the Word converter
Co-Authored-By: Claude Sonnet 5.5 <noreply@anthropic.com>
</commit_message>
<xml_diff>
--- a/docs/BAO-CAO-CEO.docx
+++ b/docs/BAO-CAO-CEO.docx
@@ -1705,7 +1705,23 @@
               <w:rPr>
                 <w:rFonts w:ascii="Calibri" w:cs="Calibri" w:eastAsia="Calibri" w:hAnsi="Calibri"/>
               </w:rPr>
-              <w:t xml:space="preserve">Cài tiện ích Codex trong profile dùng cho MISA.</w:t>
+              <w:t xml:space="preserve">Cài tiện ích ChatGPT cho Chrome (</w:t>
+            </w:r>
+            <w:hyperlink w:history="1" r:id="rIdu_zutkfnhue0mbpelx-so">
+              <w:r>
+                <w:rPr>
+                  <w:u w:val="single"/>
+                  <w:color w:val="0563C1"/>
+                  <w:rFonts w:ascii="Calibri" w:cs="Calibri" w:eastAsia="Calibri" w:hAnsi="Calibri"/>
+                </w:rPr>
+                <w:t xml:space="preserve">Chrome Web Store</w:t>
+              </w:r>
+            </w:hyperlink>
+            <w:r>
+              <w:rPr>
+                <w:rFonts w:ascii="Calibri" w:cs="Calibri" w:eastAsia="Calibri" w:hAnsi="Calibri"/>
+              </w:rPr>
+              <w:t xml:space="preserve">) trong profile dùng cho MISA.</w:t>
             </w:r>
           </w:p>
         </w:tc>

</xml_diff>